<commit_message>
Refactor ALL FITS Technical Report and enhance social features
</commit_message>
<xml_diff>
--- a/docs/ALL_FITS_Technical_Report_v3.docx
+++ b/docs/ALL_FITS_Technical_Report_v3.docx
@@ -292,7 +292,7 @@
           <w:p>
             <w:proofErr w:type="spellStart"/>
             <w:r>
-              <w:t>Kiến trúc app, Supabase (schema, RLS), tủ đồ, ghép outfit, Swipe outfit, payOS, AI Stylist (lịch sử chat), AI Try-on, AI nhận diện món đồ, mạng xã hội, UI</w:t>
+              <w:t>Kiến trúc app, Supabase (schema, RLS), tủ đồ, ghép outfit, Swipe outfit, payOS, AI Stylist (lịch sử chat), AI Try-on, AI nhận diện món đồ, mạng xã hội, dark mode, UI</w:t>
             </w:r>
             <w:proofErr w:type="spellEnd"/>
             <w:proofErr w:type="spellStart"/>
@@ -341,7 +341,7 @@
           </w:tcPr>
           <w:p>
             <w:r>
-              <w:t>80%</w:t>
+              <w:t>52%</w:t>
             </w:r>
           </w:p>
         </w:tc>
@@ -423,7 +423,7 @@
           <w:p>
             <w:proofErr w:type="spellStart"/>
             <w:r>
-              <w:t>Gói Free/Premium, danh sách mua sắm, gợi ý outfit theo thời tiết, đăng nhập Facebook, nhiều ảnh cho một món đồ</w:t>
+              <w:t>Gói Free/Premium, gợi ý outfit theo thời tiết, đăng nhập Facebook, nhiều ảnh cho một món đồ</w:t>
             </w:r>
             <w:proofErr w:type="spellEnd"/>
             <w:proofErr w:type="spellStart"/>
@@ -458,7 +458,7 @@
           </w:tcPr>
           <w:p>
             <w:r>
-              <w:t>8%</w:t>
+              <w:t>17%</w:t>
             </w:r>
           </w:p>
         </w:tc>
@@ -566,7 +566,7 @@
           </w:tcPr>
           <w:p>
             <w:r>
-              <w:t>4%</w:t>
+              <w:t>9%</w:t>
             </w:r>
           </w:p>
         </w:tc>
@@ -679,7 +679,7 @@
           </w:tcPr>
           <w:p>
             <w:r>
-              <w:t>3%</w:t>
+              <w:t>13%</w:t>
             </w:r>
           </w:p>
         </w:tc>
@@ -794,7 +794,7 @@
           </w:tcPr>
           <w:p>
             <w:r>
-              <w:t>5%</w:t>
+              <w:t>9%</w:t>
             </w:r>
           </w:p>
         </w:tc>
@@ -1218,7 +1218,7 @@
         <w:t>Functional Requirements:</w:t>
       </w:r>
       <w:r>
-        <w:t xml:space="preserve"> Đăng nhập (Email, Google, Facebook), Quên mật khẩu, Quản lý tủ đồ (nhiều ảnh, tag tùy chỉnh), Thêm đồ từ link shop, AI nhận diện món đồ, Ghép outfit (sticker, kiểu tóc), Swipe outfit, Lên lịch outfit, Thống kê, Collections, Danh sách mua sắm, Gợi ý theo thời tiết, Chuyến đi &amp; danh sách đồ mang theo, AI Stylist, AI Try-on, Thanh toán Premium (payOS), Mạng xã hội (Follow, Discover).</w:t>
+        <w:t xml:space="preserve"> Đăng nhập (Email, Google, Facebook), Quên mật khẩu, Quản lý tủ đồ (nhiều ảnh, tag tùy chỉnh), Thêm đồ từ link shop, AI nhận diện món đồ, Ghép outfit (sticker, kiểu tóc), Swipe outfit, Lên lịch outfit, Thống kê, Collections, Gợi ý theo thời tiết, Chuyến đi &amp; danh sách đồ mang theo, AI Stylist, AI Try-on, Thanh toán Premium (payOS), Mạng xã hội (Follow, Discover), Chế độ tối (Dark mode).</w:t>
       </w:r>
       <w:proofErr w:type="spellStart"/>
       <w:proofErr w:type="spellEnd"/>
@@ -1482,116 +1482,35 @@
       </w:pPr>
       <w:proofErr w:type="spellStart"/>
       <w:r>
-        <w:t>Tính</w:t>
-      </w:r>
-      <w:proofErr w:type="spellEnd"/>
-      <w:r>
-        <w:t xml:space="preserve"> </w:t>
-      </w:r>
-      <w:proofErr w:type="spellStart"/>
-      <w:r>
-        <w:t>khả</w:t>
-      </w:r>
-      <w:proofErr w:type="spellEnd"/>
-      <w:r>
-        <w:t xml:space="preserve"> </w:t>
-      </w:r>
-      <w:proofErr w:type="spellStart"/>
-      <w:r>
-        <w:t>dụng</w:t>
-      </w:r>
-      <w:proofErr w:type="spellEnd"/>
-      <w:r>
-        <w:t xml:space="preserve">: Giao </w:t>
-      </w:r>
-      <w:proofErr w:type="spellStart"/>
-      <w:r>
-        <w:t>diện</w:t>
-      </w:r>
-      <w:proofErr w:type="spellEnd"/>
-      <w:r>
-        <w:t xml:space="preserve"> </w:t>
-      </w:r>
-      <w:proofErr w:type="spellStart"/>
-      <w:r>
-        <w:t>tối</w:t>
-      </w:r>
-      <w:proofErr w:type="spellEnd"/>
-      <w:r>
-        <w:t xml:space="preserve"> </w:t>
-      </w:r>
-      <w:proofErr w:type="spellStart"/>
-      <w:r>
-        <w:t>giản</w:t>
-      </w:r>
-      <w:proofErr w:type="spellEnd"/>
-      <w:r>
-        <w:t xml:space="preserve"> </w:t>
-      </w:r>
-      <w:proofErr w:type="spellStart"/>
-      <w:r>
-        <w:t>theo</w:t>
-      </w:r>
-      <w:proofErr w:type="spellEnd"/>
-      <w:r>
-        <w:t xml:space="preserve"> Fits, </w:t>
-      </w:r>
-      <w:proofErr w:type="spellStart"/>
-      <w:r>
-        <w:t>hỗ</w:t>
-      </w:r>
-      <w:proofErr w:type="spellEnd"/>
-      <w:r>
-        <w:t xml:space="preserve"> </w:t>
-      </w:r>
-      <w:proofErr w:type="spellStart"/>
-      <w:r>
-        <w:t>trợ</w:t>
-      </w:r>
-      <w:proofErr w:type="spellEnd"/>
-      <w:r>
-        <w:t xml:space="preserve"> </w:t>
-      </w:r>
-      <w:proofErr w:type="spellStart"/>
-      <w:r>
-        <w:t>chế</w:t>
-      </w:r>
-      <w:proofErr w:type="spellEnd"/>
-      <w:r>
-        <w:t xml:space="preserve"> </w:t>
-      </w:r>
-      <w:proofErr w:type="spellStart"/>
-      <w:r>
-        <w:t>độ</w:t>
-      </w:r>
-      <w:proofErr w:type="spellEnd"/>
-      <w:r>
-        <w:t xml:space="preserve"> Offline (</w:t>
-      </w:r>
-      <w:proofErr w:type="spellStart"/>
-      <w:r>
-        <w:t>lưu</w:t>
-      </w:r>
-      <w:proofErr w:type="spellEnd"/>
-      <w:r>
-        <w:t xml:space="preserve"> </w:t>
-      </w:r>
-      <w:proofErr w:type="spellStart"/>
-      <w:r>
-        <w:t>cục</w:t>
-      </w:r>
-      <w:proofErr w:type="spellEnd"/>
-      <w:r>
-        <w:t xml:space="preserve"> </w:t>
-      </w:r>
-      <w:proofErr w:type="spellStart"/>
-      <w:r>
-        <w:t>bộ</w:t>
-      </w:r>
-      <w:proofErr w:type="spellEnd"/>
-      <w:r>
-        <w:t>).</w:t>
-      </w:r>
+        <w:t>Tính khả dụng: Giao diện tối giản theo Fits, có chế độ sáng/tối/theo hệ thống, hỗ trợ chế độ Offline (lưu cục bộ).</w:t>
+      </w:r>
+      <w:proofErr w:type="spellEnd"/>
+      <w:proofErr w:type="spellStart"/>
+      <w:proofErr w:type="spellEnd"/>
+      <w:proofErr w:type="spellStart"/>
+      <w:proofErr w:type="spellEnd"/>
+      <w:proofErr w:type="spellStart"/>
+      <w:proofErr w:type="spellEnd"/>
+      <w:proofErr w:type="spellStart"/>
+      <w:proofErr w:type="spellEnd"/>
+      <w:proofErr w:type="spellStart"/>
+      <w:proofErr w:type="spellEnd"/>
+      <w:proofErr w:type="spellStart"/>
+      <w:proofErr w:type="spellEnd"/>
+      <w:proofErr w:type="spellStart"/>
+      <w:proofErr w:type="spellEnd"/>
+      <w:proofErr w:type="spellStart"/>
+      <w:proofErr w:type="spellEnd"/>
+      <w:proofErr w:type="spellStart"/>
+      <w:proofErr w:type="spellEnd"/>
+      <w:proofErr w:type="spellStart"/>
+      <w:proofErr w:type="spellEnd"/>
+      <w:proofErr w:type="spellStart"/>
+      <w:proofErr w:type="spellEnd"/>
+      <w:proofErr w:type="spellStart"/>
+      <w:proofErr w:type="spellEnd"/>
+      <w:proofErr w:type="spellStart"/>
+      <w:proofErr w:type="spellEnd"/>
     </w:p>
     <w:p>
       <w:pPr>
@@ -2201,7 +2120,7 @@
       </w:pPr>
       <w:proofErr w:type="spellStart"/>
       <w:r>
-        <w:t>Bảng clothing_items (các bảng outfits, calendar_entries, shopping_items, collections, trips có cùng cấu trúc):</w:t>
+        <w:t>Bảng clothing_items (các bảng outfits, calendar_entries, collections, trips có cùng cấu trúc):</w:t>
       </w:r>
       <w:proofErr w:type="spellEnd"/>
       <w:proofErr w:type="spellStart"/>
@@ -9923,7 +9842,7 @@
               <w:rPr>
                 <w:highlight w:val="yellow"/>
               </w:rPr>
-              <w:t>80%</w:t>
+              <w:t>52%</w:t>
             </w:r>
           </w:p>
         </w:tc>
@@ -9948,7 +9867,7 @@
               <w:rPr>
                 <w:highlight w:val="yellow"/>
               </w:rPr>
-              <w:t>8%</w:t>
+              <w:t>17%</w:t>
             </w:r>
           </w:p>
         </w:tc>
@@ -9973,7 +9892,7 @@
               <w:rPr>
                 <w:highlight w:val="yellow"/>
               </w:rPr>
-              <w:t>4%</w:t>
+              <w:t>9%</w:t>
             </w:r>
           </w:p>
         </w:tc>
@@ -9998,7 +9917,7 @@
               <w:rPr>
                 <w:highlight w:val="yellow"/>
               </w:rPr>
-              <w:t>3%</w:t>
+              <w:t>13%</w:t>
             </w:r>
           </w:p>
         </w:tc>
@@ -10023,7 +9942,7 @@
               <w:rPr>
                 <w:highlight w:val="yellow"/>
               </w:rPr>
-              <w:t>5%</w:t>
+              <w:t>9%</w:t>
             </w:r>
           </w:p>
         </w:tc>

</xml_diff>